<commit_message>
PPT and README file implemented
</commit_message>
<xml_diff>
--- a/courses/03-introduction-to-machine-learning/14-model-evaluation-strategies/Case study task.docx
+++ b/courses/03-introduction-to-machine-learning/14-model-evaluation-strategies/Case study task.docx
@@ -996,6 +996,1303 @@
         </w:rPr>
         <w:t>Regression:</w:t>
       </w:r>
+    </w:p>
+    <w:p>
+      <w:pPr>
+        <w:spacing w:after="0"/>
+        <w:jc w:val="both"/>
+        <w:rPr>
+          <w:lang w:val="en-US"/>
+        </w:rPr>
+      </w:pPr>
+    </w:p>
+    <w:p>
+      <w:pPr>
+        <w:spacing w:after="0"/>
+        <w:jc w:val="both"/>
+        <w:rPr>
+          <w:lang w:val="en-US"/>
+        </w:rPr>
+      </w:pPr>
+      <w:r>
+        <w:rPr>
+          <w:lang w:val="en-US"/>
+        </w:rPr>
+        <w:t xml:space="preserve">import </w:t>
+      </w:r>
+      <w:proofErr w:type="spellStart"/>
+      <w:r>
+        <w:rPr>
+          <w:lang w:val="en-US"/>
+        </w:rPr>
+        <w:t>numpy</w:t>
+      </w:r>
+      <w:proofErr w:type="spellEnd"/>
+      <w:r>
+        <w:rPr>
+          <w:lang w:val="en-US"/>
+        </w:rPr>
+        <w:t xml:space="preserve"> as np</w:t>
+      </w:r>
+    </w:p>
+    <w:p>
+      <w:pPr>
+        <w:spacing w:after="0"/>
+        <w:jc w:val="both"/>
+        <w:rPr>
+          <w:lang w:val="en-US"/>
+        </w:rPr>
+      </w:pPr>
+    </w:p>
+    <w:p>
+      <w:pPr>
+        <w:spacing w:after="0"/>
+        <w:jc w:val="both"/>
+        <w:rPr>
+          <w:lang w:val="en-US"/>
+        </w:rPr>
+      </w:pPr>
+      <w:r>
+        <w:rPr>
+          <w:lang w:val="en-US"/>
+        </w:rPr>
+        <w:t xml:space="preserve">def </w:t>
+      </w:r>
+      <w:proofErr w:type="spellStart"/>
+      <w:proofErr w:type="gramStart"/>
+      <w:r>
+        <w:rPr>
+          <w:lang w:val="en-US"/>
+        </w:rPr>
+        <w:t>mse</w:t>
+      </w:r>
+      <w:proofErr w:type="spellEnd"/>
+      <w:r>
+        <w:rPr>
+          <w:lang w:val="en-US"/>
+        </w:rPr>
+        <w:t>(</w:t>
+      </w:r>
+      <w:proofErr w:type="spellStart"/>
+      <w:proofErr w:type="gramEnd"/>
+      <w:r>
+        <w:rPr>
+          <w:lang w:val="en-US"/>
+        </w:rPr>
+        <w:t>y_true</w:t>
+      </w:r>
+      <w:proofErr w:type="spellEnd"/>
+      <w:r>
+        <w:rPr>
+          <w:lang w:val="en-US"/>
+        </w:rPr>
+        <w:t xml:space="preserve">, </w:t>
+      </w:r>
+      <w:proofErr w:type="spellStart"/>
+      <w:r>
+        <w:rPr>
+          <w:lang w:val="en-US"/>
+        </w:rPr>
+        <w:t>y_pred</w:t>
+      </w:r>
+      <w:proofErr w:type="spellEnd"/>
+      <w:r>
+        <w:rPr>
+          <w:lang w:val="en-US"/>
+        </w:rPr>
+        <w:t>):</w:t>
+      </w:r>
+    </w:p>
+    <w:p>
+      <w:pPr>
+        <w:spacing w:after="0"/>
+        <w:jc w:val="both"/>
+        <w:rPr>
+          <w:lang w:val="en-US"/>
+        </w:rPr>
+      </w:pPr>
+      <w:r>
+        <w:rPr>
+          <w:lang w:val="en-US"/>
+        </w:rPr>
+        <w:t xml:space="preserve">    </w:t>
+      </w:r>
+      <w:proofErr w:type="spellStart"/>
+      <w:r>
+        <w:rPr>
+          <w:lang w:val="en-US"/>
+        </w:rPr>
+        <w:t>y_true</w:t>
+      </w:r>
+      <w:proofErr w:type="spellEnd"/>
+      <w:r>
+        <w:rPr>
+          <w:lang w:val="en-US"/>
+        </w:rPr>
+        <w:t xml:space="preserve">, </w:t>
+      </w:r>
+      <w:proofErr w:type="spellStart"/>
+      <w:r>
+        <w:rPr>
+          <w:lang w:val="en-US"/>
+        </w:rPr>
+        <w:t>y_pred</w:t>
+      </w:r>
+      <w:proofErr w:type="spellEnd"/>
+      <w:r>
+        <w:rPr>
+          <w:lang w:val="en-US"/>
+        </w:rPr>
+        <w:t xml:space="preserve"> = </w:t>
+      </w:r>
+      <w:proofErr w:type="spellStart"/>
+      <w:proofErr w:type="gramStart"/>
+      <w:r>
+        <w:rPr>
+          <w:lang w:val="en-US"/>
+        </w:rPr>
+        <w:t>np.array</w:t>
+      </w:r>
+      <w:proofErr w:type="spellEnd"/>
+      <w:proofErr w:type="gramEnd"/>
+      <w:r>
+        <w:rPr>
+          <w:lang w:val="en-US"/>
+        </w:rPr>
+        <w:t>(</w:t>
+      </w:r>
+      <w:proofErr w:type="spellStart"/>
+      <w:r>
+        <w:rPr>
+          <w:lang w:val="en-US"/>
+        </w:rPr>
+        <w:t>y_true</w:t>
+      </w:r>
+      <w:proofErr w:type="spellEnd"/>
+      <w:r>
+        <w:rPr>
+          <w:lang w:val="en-US"/>
+        </w:rPr>
+        <w:t xml:space="preserve">, float), </w:t>
+      </w:r>
+      <w:proofErr w:type="spellStart"/>
+      <w:proofErr w:type="gramStart"/>
+      <w:r>
+        <w:rPr>
+          <w:lang w:val="en-US"/>
+        </w:rPr>
+        <w:t>np.array</w:t>
+      </w:r>
+      <w:proofErr w:type="spellEnd"/>
+      <w:proofErr w:type="gramEnd"/>
+      <w:r>
+        <w:rPr>
+          <w:lang w:val="en-US"/>
+        </w:rPr>
+        <w:t>(</w:t>
+      </w:r>
+      <w:proofErr w:type="spellStart"/>
+      <w:r>
+        <w:rPr>
+          <w:lang w:val="en-US"/>
+        </w:rPr>
+        <w:t>y_pred</w:t>
+      </w:r>
+      <w:proofErr w:type="spellEnd"/>
+      <w:r>
+        <w:rPr>
+          <w:lang w:val="en-US"/>
+        </w:rPr>
+        <w:t>, float)</w:t>
+      </w:r>
+    </w:p>
+    <w:p>
+      <w:pPr>
+        <w:spacing w:after="0"/>
+        <w:jc w:val="both"/>
+        <w:rPr>
+          <w:lang w:val="en-US"/>
+        </w:rPr>
+      </w:pPr>
+      <w:r>
+        <w:rPr>
+          <w:lang w:val="en-US"/>
+        </w:rPr>
+        <w:t xml:space="preserve">    return </w:t>
+      </w:r>
+      <w:proofErr w:type="spellStart"/>
+      <w:proofErr w:type="gramStart"/>
+      <w:r>
+        <w:rPr>
+          <w:lang w:val="en-US"/>
+        </w:rPr>
+        <w:t>np.mean</w:t>
+      </w:r>
+      <w:proofErr w:type="spellEnd"/>
+      <w:proofErr w:type="gramEnd"/>
+      <w:r>
+        <w:rPr>
+          <w:lang w:val="en-US"/>
+        </w:rPr>
+        <w:t>((</w:t>
+      </w:r>
+      <w:proofErr w:type="spellStart"/>
+      <w:r>
+        <w:rPr>
+          <w:lang w:val="en-US"/>
+        </w:rPr>
+        <w:t>y_true</w:t>
+      </w:r>
+      <w:proofErr w:type="spellEnd"/>
+      <w:r>
+        <w:rPr>
+          <w:lang w:val="en-US"/>
+        </w:rPr>
+        <w:t xml:space="preserve"> - </w:t>
+      </w:r>
+      <w:proofErr w:type="spellStart"/>
+      <w:r>
+        <w:rPr>
+          <w:lang w:val="en-US"/>
+        </w:rPr>
+        <w:t>y_pred</w:t>
+      </w:r>
+      <w:proofErr w:type="spellEnd"/>
+      <w:r>
+        <w:rPr>
+          <w:lang w:val="en-US"/>
+        </w:rPr>
+        <w:t>) ** 2)</w:t>
+      </w:r>
+    </w:p>
+    <w:p>
+      <w:pPr>
+        <w:spacing w:after="0"/>
+        <w:jc w:val="both"/>
+        <w:rPr>
+          <w:lang w:val="en-US"/>
+        </w:rPr>
+      </w:pPr>
+    </w:p>
+    <w:p>
+      <w:pPr>
+        <w:spacing w:after="0"/>
+        <w:jc w:val="both"/>
+        <w:rPr>
+          <w:lang w:val="en-US"/>
+        </w:rPr>
+      </w:pPr>
+      <w:r>
+        <w:rPr>
+          <w:lang w:val="en-US"/>
+        </w:rPr>
+        <w:t xml:space="preserve">def </w:t>
+      </w:r>
+      <w:proofErr w:type="spellStart"/>
+      <w:proofErr w:type="gramStart"/>
+      <w:r>
+        <w:rPr>
+          <w:lang w:val="en-US"/>
+        </w:rPr>
+        <w:t>rmse</w:t>
+      </w:r>
+      <w:proofErr w:type="spellEnd"/>
+      <w:r>
+        <w:rPr>
+          <w:lang w:val="en-US"/>
+        </w:rPr>
+        <w:t>(</w:t>
+      </w:r>
+      <w:proofErr w:type="spellStart"/>
+      <w:proofErr w:type="gramEnd"/>
+      <w:r>
+        <w:rPr>
+          <w:lang w:val="en-US"/>
+        </w:rPr>
+        <w:t>y_true</w:t>
+      </w:r>
+      <w:proofErr w:type="spellEnd"/>
+      <w:r>
+        <w:rPr>
+          <w:lang w:val="en-US"/>
+        </w:rPr>
+        <w:t xml:space="preserve">, </w:t>
+      </w:r>
+      <w:proofErr w:type="spellStart"/>
+      <w:r>
+        <w:rPr>
+          <w:lang w:val="en-US"/>
+        </w:rPr>
+        <w:t>y_pred</w:t>
+      </w:r>
+      <w:proofErr w:type="spellEnd"/>
+      <w:r>
+        <w:rPr>
+          <w:lang w:val="en-US"/>
+        </w:rPr>
+        <w:t>):</w:t>
+      </w:r>
+    </w:p>
+    <w:p>
+      <w:pPr>
+        <w:spacing w:after="0"/>
+        <w:jc w:val="both"/>
+        <w:rPr>
+          <w:lang w:val="en-US"/>
+        </w:rPr>
+      </w:pPr>
+      <w:r>
+        <w:rPr>
+          <w:lang w:val="en-US"/>
+        </w:rPr>
+        <w:t xml:space="preserve">    return </w:t>
+      </w:r>
+      <w:proofErr w:type="spellStart"/>
+      <w:proofErr w:type="gramStart"/>
+      <w:r>
+        <w:rPr>
+          <w:lang w:val="en-US"/>
+        </w:rPr>
+        <w:t>np.sqrt</w:t>
+      </w:r>
+      <w:proofErr w:type="spellEnd"/>
+      <w:proofErr w:type="gramEnd"/>
+      <w:r>
+        <w:rPr>
+          <w:lang w:val="en-US"/>
+        </w:rPr>
+        <w:t>(</w:t>
+      </w:r>
+      <w:proofErr w:type="spellStart"/>
+      <w:proofErr w:type="gramStart"/>
+      <w:r>
+        <w:rPr>
+          <w:lang w:val="en-US"/>
+        </w:rPr>
+        <w:t>mse</w:t>
+      </w:r>
+      <w:proofErr w:type="spellEnd"/>
+      <w:r>
+        <w:rPr>
+          <w:lang w:val="en-US"/>
+        </w:rPr>
+        <w:t>(</w:t>
+      </w:r>
+      <w:proofErr w:type="spellStart"/>
+      <w:proofErr w:type="gramEnd"/>
+      <w:r>
+        <w:rPr>
+          <w:lang w:val="en-US"/>
+        </w:rPr>
+        <w:t>y_true</w:t>
+      </w:r>
+      <w:proofErr w:type="spellEnd"/>
+      <w:r>
+        <w:rPr>
+          <w:lang w:val="en-US"/>
+        </w:rPr>
+        <w:t xml:space="preserve">, </w:t>
+      </w:r>
+      <w:proofErr w:type="spellStart"/>
+      <w:r>
+        <w:rPr>
+          <w:lang w:val="en-US"/>
+        </w:rPr>
+        <w:t>y_pred</w:t>
+      </w:r>
+      <w:proofErr w:type="spellEnd"/>
+      <w:r>
+        <w:rPr>
+          <w:lang w:val="en-US"/>
+        </w:rPr>
+        <w:t>))</w:t>
+      </w:r>
+    </w:p>
+    <w:p>
+      <w:pPr>
+        <w:spacing w:after="0"/>
+        <w:jc w:val="both"/>
+        <w:rPr>
+          <w:lang w:val="en-US"/>
+        </w:rPr>
+      </w:pPr>
+    </w:p>
+    <w:p>
+      <w:pPr>
+        <w:spacing w:after="0"/>
+        <w:jc w:val="both"/>
+        <w:rPr>
+          <w:lang w:val="en-US"/>
+        </w:rPr>
+      </w:pPr>
+      <w:r>
+        <w:rPr>
+          <w:lang w:val="en-US"/>
+        </w:rPr>
+        <w:t xml:space="preserve">def </w:t>
+      </w:r>
+      <w:proofErr w:type="spellStart"/>
+      <w:proofErr w:type="gramStart"/>
+      <w:r>
+        <w:rPr>
+          <w:lang w:val="en-US"/>
+        </w:rPr>
+        <w:t>mae</w:t>
+      </w:r>
+      <w:proofErr w:type="spellEnd"/>
+      <w:r>
+        <w:rPr>
+          <w:lang w:val="en-US"/>
+        </w:rPr>
+        <w:t>(</w:t>
+      </w:r>
+      <w:proofErr w:type="spellStart"/>
+      <w:proofErr w:type="gramEnd"/>
+      <w:r>
+        <w:rPr>
+          <w:lang w:val="en-US"/>
+        </w:rPr>
+        <w:t>y_true</w:t>
+      </w:r>
+      <w:proofErr w:type="spellEnd"/>
+      <w:r>
+        <w:rPr>
+          <w:lang w:val="en-US"/>
+        </w:rPr>
+        <w:t xml:space="preserve">, </w:t>
+      </w:r>
+      <w:proofErr w:type="spellStart"/>
+      <w:r>
+        <w:rPr>
+          <w:lang w:val="en-US"/>
+        </w:rPr>
+        <w:t>y_pred</w:t>
+      </w:r>
+      <w:proofErr w:type="spellEnd"/>
+      <w:r>
+        <w:rPr>
+          <w:lang w:val="en-US"/>
+        </w:rPr>
+        <w:t>):</w:t>
+      </w:r>
+    </w:p>
+    <w:p>
+      <w:pPr>
+        <w:spacing w:after="0"/>
+        <w:jc w:val="both"/>
+        <w:rPr>
+          <w:lang w:val="en-US"/>
+        </w:rPr>
+      </w:pPr>
+      <w:r>
+        <w:rPr>
+          <w:lang w:val="en-US"/>
+        </w:rPr>
+        <w:t xml:space="preserve">    </w:t>
+      </w:r>
+      <w:proofErr w:type="spellStart"/>
+      <w:r>
+        <w:rPr>
+          <w:lang w:val="en-US"/>
+        </w:rPr>
+        <w:t>y_true</w:t>
+      </w:r>
+      <w:proofErr w:type="spellEnd"/>
+      <w:r>
+        <w:rPr>
+          <w:lang w:val="en-US"/>
+        </w:rPr>
+        <w:t xml:space="preserve">, </w:t>
+      </w:r>
+      <w:proofErr w:type="spellStart"/>
+      <w:r>
+        <w:rPr>
+          <w:lang w:val="en-US"/>
+        </w:rPr>
+        <w:t>y_pred</w:t>
+      </w:r>
+      <w:proofErr w:type="spellEnd"/>
+      <w:r>
+        <w:rPr>
+          <w:lang w:val="en-US"/>
+        </w:rPr>
+        <w:t xml:space="preserve"> = </w:t>
+      </w:r>
+      <w:proofErr w:type="spellStart"/>
+      <w:proofErr w:type="gramStart"/>
+      <w:r>
+        <w:rPr>
+          <w:lang w:val="en-US"/>
+        </w:rPr>
+        <w:t>np.array</w:t>
+      </w:r>
+      <w:proofErr w:type="spellEnd"/>
+      <w:proofErr w:type="gramEnd"/>
+      <w:r>
+        <w:rPr>
+          <w:lang w:val="en-US"/>
+        </w:rPr>
+        <w:t>(</w:t>
+      </w:r>
+      <w:proofErr w:type="spellStart"/>
+      <w:r>
+        <w:rPr>
+          <w:lang w:val="en-US"/>
+        </w:rPr>
+        <w:t>y_true</w:t>
+      </w:r>
+      <w:proofErr w:type="spellEnd"/>
+      <w:r>
+        <w:rPr>
+          <w:lang w:val="en-US"/>
+        </w:rPr>
+        <w:t xml:space="preserve">, float), </w:t>
+      </w:r>
+      <w:proofErr w:type="spellStart"/>
+      <w:proofErr w:type="gramStart"/>
+      <w:r>
+        <w:rPr>
+          <w:lang w:val="en-US"/>
+        </w:rPr>
+        <w:t>np.array</w:t>
+      </w:r>
+      <w:proofErr w:type="spellEnd"/>
+      <w:proofErr w:type="gramEnd"/>
+      <w:r>
+        <w:rPr>
+          <w:lang w:val="en-US"/>
+        </w:rPr>
+        <w:t>(</w:t>
+      </w:r>
+      <w:proofErr w:type="spellStart"/>
+      <w:r>
+        <w:rPr>
+          <w:lang w:val="en-US"/>
+        </w:rPr>
+        <w:t>y_pred</w:t>
+      </w:r>
+      <w:proofErr w:type="spellEnd"/>
+      <w:r>
+        <w:rPr>
+          <w:lang w:val="en-US"/>
+        </w:rPr>
+        <w:t>, float)</w:t>
+      </w:r>
+    </w:p>
+    <w:p>
+      <w:pPr>
+        <w:spacing w:after="0"/>
+        <w:jc w:val="both"/>
+        <w:rPr>
+          <w:lang w:val="en-US"/>
+        </w:rPr>
+      </w:pPr>
+      <w:r>
+        <w:rPr>
+          <w:lang w:val="en-US"/>
+        </w:rPr>
+        <w:t xml:space="preserve">    return </w:t>
+      </w:r>
+      <w:proofErr w:type="spellStart"/>
+      <w:proofErr w:type="gramStart"/>
+      <w:r>
+        <w:rPr>
+          <w:lang w:val="en-US"/>
+        </w:rPr>
+        <w:t>np.mean</w:t>
+      </w:r>
+      <w:proofErr w:type="spellEnd"/>
+      <w:proofErr w:type="gramEnd"/>
+      <w:r>
+        <w:rPr>
+          <w:lang w:val="en-US"/>
+        </w:rPr>
+        <w:t>(</w:t>
+      </w:r>
+      <w:proofErr w:type="spellStart"/>
+      <w:proofErr w:type="gramStart"/>
+      <w:r>
+        <w:rPr>
+          <w:lang w:val="en-US"/>
+        </w:rPr>
+        <w:t>np.abs</w:t>
+      </w:r>
+      <w:proofErr w:type="spellEnd"/>
+      <w:r>
+        <w:rPr>
+          <w:lang w:val="en-US"/>
+        </w:rPr>
+        <w:t>(</w:t>
+      </w:r>
+      <w:proofErr w:type="spellStart"/>
+      <w:proofErr w:type="gramEnd"/>
+      <w:r>
+        <w:rPr>
+          <w:lang w:val="en-US"/>
+        </w:rPr>
+        <w:t>y_true</w:t>
+      </w:r>
+      <w:proofErr w:type="spellEnd"/>
+      <w:r>
+        <w:rPr>
+          <w:lang w:val="en-US"/>
+        </w:rPr>
+        <w:t xml:space="preserve"> - </w:t>
+      </w:r>
+      <w:proofErr w:type="spellStart"/>
+      <w:r>
+        <w:rPr>
+          <w:lang w:val="en-US"/>
+        </w:rPr>
+        <w:t>y_pred</w:t>
+      </w:r>
+      <w:proofErr w:type="spellEnd"/>
+      <w:r>
+        <w:rPr>
+          <w:lang w:val="en-US"/>
+        </w:rPr>
+        <w:t>))</w:t>
+      </w:r>
+    </w:p>
+    <w:p>
+      <w:pPr>
+        <w:spacing w:after="0"/>
+        <w:jc w:val="both"/>
+        <w:rPr>
+          <w:lang w:val="en-US"/>
+        </w:rPr>
+      </w:pPr>
+    </w:p>
+    <w:p>
+      <w:pPr>
+        <w:spacing w:after="0"/>
+        <w:jc w:val="both"/>
+        <w:rPr>
+          <w:lang w:val="en-US"/>
+        </w:rPr>
+      </w:pPr>
+      <w:r>
+        <w:rPr>
+          <w:lang w:val="en-US"/>
+        </w:rPr>
+        <w:t xml:space="preserve">def </w:t>
+      </w:r>
+      <w:proofErr w:type="spellStart"/>
+      <w:proofErr w:type="gramStart"/>
+      <w:r>
+        <w:rPr>
+          <w:lang w:val="en-US"/>
+        </w:rPr>
+        <w:t>mape</w:t>
+      </w:r>
+      <w:proofErr w:type="spellEnd"/>
+      <w:r>
+        <w:rPr>
+          <w:lang w:val="en-US"/>
+        </w:rPr>
+        <w:t>(</w:t>
+      </w:r>
+      <w:proofErr w:type="spellStart"/>
+      <w:proofErr w:type="gramEnd"/>
+      <w:r>
+        <w:rPr>
+          <w:lang w:val="en-US"/>
+        </w:rPr>
+        <w:t>y_true</w:t>
+      </w:r>
+      <w:proofErr w:type="spellEnd"/>
+      <w:r>
+        <w:rPr>
+          <w:lang w:val="en-US"/>
+        </w:rPr>
+        <w:t xml:space="preserve">, </w:t>
+      </w:r>
+      <w:proofErr w:type="spellStart"/>
+      <w:r>
+        <w:rPr>
+          <w:lang w:val="en-US"/>
+        </w:rPr>
+        <w:t>y_pred</w:t>
+      </w:r>
+      <w:proofErr w:type="spellEnd"/>
+      <w:r>
+        <w:rPr>
+          <w:lang w:val="en-US"/>
+        </w:rPr>
+        <w:t>):</w:t>
+      </w:r>
+    </w:p>
+    <w:p>
+      <w:pPr>
+        <w:spacing w:after="0"/>
+        <w:jc w:val="both"/>
+        <w:rPr>
+          <w:lang w:val="en-US"/>
+        </w:rPr>
+      </w:pPr>
+      <w:r>
+        <w:rPr>
+          <w:lang w:val="en-US"/>
+        </w:rPr>
+        <w:t xml:space="preserve">    </w:t>
+      </w:r>
+      <w:proofErr w:type="spellStart"/>
+      <w:r>
+        <w:rPr>
+          <w:lang w:val="en-US"/>
+        </w:rPr>
+        <w:t>y_true</w:t>
+      </w:r>
+      <w:proofErr w:type="spellEnd"/>
+      <w:r>
+        <w:rPr>
+          <w:lang w:val="en-US"/>
+        </w:rPr>
+        <w:t xml:space="preserve">, </w:t>
+      </w:r>
+      <w:proofErr w:type="spellStart"/>
+      <w:r>
+        <w:rPr>
+          <w:lang w:val="en-US"/>
+        </w:rPr>
+        <w:t>y_pred</w:t>
+      </w:r>
+      <w:proofErr w:type="spellEnd"/>
+      <w:r>
+        <w:rPr>
+          <w:lang w:val="en-US"/>
+        </w:rPr>
+        <w:t xml:space="preserve"> = </w:t>
+      </w:r>
+      <w:proofErr w:type="spellStart"/>
+      <w:proofErr w:type="gramStart"/>
+      <w:r>
+        <w:rPr>
+          <w:lang w:val="en-US"/>
+        </w:rPr>
+        <w:t>np.array</w:t>
+      </w:r>
+      <w:proofErr w:type="spellEnd"/>
+      <w:proofErr w:type="gramEnd"/>
+      <w:r>
+        <w:rPr>
+          <w:lang w:val="en-US"/>
+        </w:rPr>
+        <w:t>(</w:t>
+      </w:r>
+      <w:proofErr w:type="spellStart"/>
+      <w:r>
+        <w:rPr>
+          <w:lang w:val="en-US"/>
+        </w:rPr>
+        <w:t>y_true</w:t>
+      </w:r>
+      <w:proofErr w:type="spellEnd"/>
+      <w:r>
+        <w:rPr>
+          <w:lang w:val="en-US"/>
+        </w:rPr>
+        <w:t xml:space="preserve">, float), </w:t>
+      </w:r>
+      <w:proofErr w:type="spellStart"/>
+      <w:proofErr w:type="gramStart"/>
+      <w:r>
+        <w:rPr>
+          <w:lang w:val="en-US"/>
+        </w:rPr>
+        <w:t>np.array</w:t>
+      </w:r>
+      <w:proofErr w:type="spellEnd"/>
+      <w:proofErr w:type="gramEnd"/>
+      <w:r>
+        <w:rPr>
+          <w:lang w:val="en-US"/>
+        </w:rPr>
+        <w:t>(</w:t>
+      </w:r>
+      <w:proofErr w:type="spellStart"/>
+      <w:r>
+        <w:rPr>
+          <w:lang w:val="en-US"/>
+        </w:rPr>
+        <w:t>y_pred</w:t>
+      </w:r>
+      <w:proofErr w:type="spellEnd"/>
+      <w:r>
+        <w:rPr>
+          <w:lang w:val="en-US"/>
+        </w:rPr>
+        <w:t>, float)</w:t>
+      </w:r>
+    </w:p>
+    <w:p>
+      <w:pPr>
+        <w:spacing w:after="0"/>
+        <w:jc w:val="both"/>
+        <w:rPr>
+          <w:lang w:val="en-US"/>
+        </w:rPr>
+      </w:pPr>
+      <w:r>
+        <w:rPr>
+          <w:lang w:val="en-US"/>
+        </w:rPr>
+        <w:t xml:space="preserve">    return </w:t>
+      </w:r>
+      <w:proofErr w:type="spellStart"/>
+      <w:proofErr w:type="gramStart"/>
+      <w:r>
+        <w:rPr>
+          <w:lang w:val="en-US"/>
+        </w:rPr>
+        <w:t>np.mean</w:t>
+      </w:r>
+      <w:proofErr w:type="spellEnd"/>
+      <w:proofErr w:type="gramEnd"/>
+      <w:r>
+        <w:rPr>
+          <w:lang w:val="en-US"/>
+        </w:rPr>
+        <w:t>(</w:t>
+      </w:r>
+      <w:proofErr w:type="spellStart"/>
+      <w:proofErr w:type="gramStart"/>
+      <w:r>
+        <w:rPr>
+          <w:lang w:val="en-US"/>
+        </w:rPr>
+        <w:t>np.abs</w:t>
+      </w:r>
+      <w:proofErr w:type="spellEnd"/>
+      <w:r>
+        <w:rPr>
+          <w:lang w:val="en-US"/>
+        </w:rPr>
+        <w:t>(</w:t>
+      </w:r>
+      <w:proofErr w:type="gramEnd"/>
+      <w:r>
+        <w:rPr>
+          <w:lang w:val="en-US"/>
+        </w:rPr>
+        <w:t>(</w:t>
+      </w:r>
+      <w:proofErr w:type="spellStart"/>
+      <w:r>
+        <w:rPr>
+          <w:lang w:val="en-US"/>
+        </w:rPr>
+        <w:t>y_true</w:t>
+      </w:r>
+      <w:proofErr w:type="spellEnd"/>
+      <w:r>
+        <w:rPr>
+          <w:lang w:val="en-US"/>
+        </w:rPr>
+        <w:t xml:space="preserve"> - </w:t>
+      </w:r>
+      <w:proofErr w:type="spellStart"/>
+      <w:r>
+        <w:rPr>
+          <w:lang w:val="en-US"/>
+        </w:rPr>
+        <w:t>y_pred</w:t>
+      </w:r>
+      <w:proofErr w:type="spellEnd"/>
+      <w:r>
+        <w:rPr>
+          <w:lang w:val="en-US"/>
+        </w:rPr>
+        <w:t xml:space="preserve">) / </w:t>
+      </w:r>
+      <w:proofErr w:type="spellStart"/>
+      <w:r>
+        <w:rPr>
+          <w:lang w:val="en-US"/>
+        </w:rPr>
+        <w:t>y_true</w:t>
+      </w:r>
+      <w:proofErr w:type="spellEnd"/>
+      <w:r>
+        <w:rPr>
+          <w:lang w:val="en-US"/>
+        </w:rPr>
+        <w:t>)) * 100</w:t>
+      </w:r>
+    </w:p>
+    <w:p>
+      <w:pPr>
+        <w:spacing w:after="0"/>
+        <w:jc w:val="both"/>
+        <w:rPr>
+          <w:lang w:val="en-US"/>
+        </w:rPr>
+      </w:pPr>
+    </w:p>
+    <w:p>
+      <w:pPr>
+        <w:spacing w:after="0"/>
+        <w:jc w:val="both"/>
+        <w:rPr>
+          <w:lang w:val="en-US"/>
+        </w:rPr>
+      </w:pPr>
+      <w:r>
+        <w:rPr>
+          <w:lang w:val="en-US"/>
+        </w:rPr>
+        <w:t>def r2_</w:t>
+      </w:r>
+      <w:proofErr w:type="gramStart"/>
+      <w:r>
+        <w:rPr>
+          <w:lang w:val="en-US"/>
+        </w:rPr>
+        <w:t>score(</w:t>
+      </w:r>
+      <w:proofErr w:type="spellStart"/>
+      <w:proofErr w:type="gramEnd"/>
+      <w:r>
+        <w:rPr>
+          <w:lang w:val="en-US"/>
+        </w:rPr>
+        <w:t>y_true</w:t>
+      </w:r>
+      <w:proofErr w:type="spellEnd"/>
+      <w:r>
+        <w:rPr>
+          <w:lang w:val="en-US"/>
+        </w:rPr>
+        <w:t xml:space="preserve">, </w:t>
+      </w:r>
+      <w:proofErr w:type="spellStart"/>
+      <w:r>
+        <w:rPr>
+          <w:lang w:val="en-US"/>
+        </w:rPr>
+        <w:t>y_pred</w:t>
+      </w:r>
+      <w:proofErr w:type="spellEnd"/>
+      <w:r>
+        <w:rPr>
+          <w:lang w:val="en-US"/>
+        </w:rPr>
+        <w:t>):</w:t>
+      </w:r>
+    </w:p>
+    <w:p>
+      <w:pPr>
+        <w:spacing w:after="0"/>
+        <w:jc w:val="both"/>
+        <w:rPr>
+          <w:lang w:val="en-US"/>
+        </w:rPr>
+      </w:pPr>
+      <w:r>
+        <w:rPr>
+          <w:lang w:val="en-US"/>
+        </w:rPr>
+        <w:t xml:space="preserve">    </w:t>
+      </w:r>
+      <w:proofErr w:type="spellStart"/>
+      <w:r>
+        <w:rPr>
+          <w:lang w:val="en-US"/>
+        </w:rPr>
+        <w:t>y_true</w:t>
+      </w:r>
+      <w:proofErr w:type="spellEnd"/>
+      <w:r>
+        <w:rPr>
+          <w:lang w:val="en-US"/>
+        </w:rPr>
+        <w:t xml:space="preserve">, </w:t>
+      </w:r>
+      <w:proofErr w:type="spellStart"/>
+      <w:r>
+        <w:rPr>
+          <w:lang w:val="en-US"/>
+        </w:rPr>
+        <w:t>y_pred</w:t>
+      </w:r>
+      <w:proofErr w:type="spellEnd"/>
+      <w:r>
+        <w:rPr>
+          <w:lang w:val="en-US"/>
+        </w:rPr>
+        <w:t xml:space="preserve"> = </w:t>
+      </w:r>
+      <w:proofErr w:type="spellStart"/>
+      <w:proofErr w:type="gramStart"/>
+      <w:r>
+        <w:rPr>
+          <w:lang w:val="en-US"/>
+        </w:rPr>
+        <w:t>np.array</w:t>
+      </w:r>
+      <w:proofErr w:type="spellEnd"/>
+      <w:proofErr w:type="gramEnd"/>
+      <w:r>
+        <w:rPr>
+          <w:lang w:val="en-US"/>
+        </w:rPr>
+        <w:t>(</w:t>
+      </w:r>
+      <w:proofErr w:type="spellStart"/>
+      <w:r>
+        <w:rPr>
+          <w:lang w:val="en-US"/>
+        </w:rPr>
+        <w:t>y_true</w:t>
+      </w:r>
+      <w:proofErr w:type="spellEnd"/>
+      <w:r>
+        <w:rPr>
+          <w:lang w:val="en-US"/>
+        </w:rPr>
+        <w:t xml:space="preserve">, float), </w:t>
+      </w:r>
+      <w:proofErr w:type="spellStart"/>
+      <w:proofErr w:type="gramStart"/>
+      <w:r>
+        <w:rPr>
+          <w:lang w:val="en-US"/>
+        </w:rPr>
+        <w:t>np.array</w:t>
+      </w:r>
+      <w:proofErr w:type="spellEnd"/>
+      <w:proofErr w:type="gramEnd"/>
+      <w:r>
+        <w:rPr>
+          <w:lang w:val="en-US"/>
+        </w:rPr>
+        <w:t>(</w:t>
+      </w:r>
+      <w:proofErr w:type="spellStart"/>
+      <w:r>
+        <w:rPr>
+          <w:lang w:val="en-US"/>
+        </w:rPr>
+        <w:t>y_pred</w:t>
+      </w:r>
+      <w:proofErr w:type="spellEnd"/>
+      <w:r>
+        <w:rPr>
+          <w:lang w:val="en-US"/>
+        </w:rPr>
+        <w:t>, float)</w:t>
+      </w:r>
+    </w:p>
+    <w:p>
+      <w:pPr>
+        <w:spacing w:after="0"/>
+        <w:jc w:val="both"/>
+        <w:rPr>
+          <w:lang w:val="en-US"/>
+        </w:rPr>
+      </w:pPr>
+      <w:r>
+        <w:rPr>
+          <w:lang w:val="en-US"/>
+        </w:rPr>
+        <w:t xml:space="preserve">    </w:t>
+      </w:r>
+      <w:proofErr w:type="spellStart"/>
+      <w:r>
+        <w:rPr>
+          <w:lang w:val="en-US"/>
+        </w:rPr>
+        <w:t>ss_res</w:t>
+      </w:r>
+      <w:proofErr w:type="spellEnd"/>
+      <w:r>
+        <w:rPr>
+          <w:lang w:val="en-US"/>
+        </w:rPr>
+        <w:t xml:space="preserve"> = </w:t>
+      </w:r>
+      <w:proofErr w:type="spellStart"/>
+      <w:proofErr w:type="gramStart"/>
+      <w:r>
+        <w:rPr>
+          <w:lang w:val="en-US"/>
+        </w:rPr>
+        <w:t>np.sum</w:t>
+      </w:r>
+      <w:proofErr w:type="spellEnd"/>
+      <w:r>
+        <w:rPr>
+          <w:lang w:val="en-US"/>
+        </w:rPr>
+        <w:t>(</w:t>
+      </w:r>
+      <w:proofErr w:type="gramEnd"/>
+      <w:r>
+        <w:rPr>
+          <w:lang w:val="en-US"/>
+        </w:rPr>
+        <w:t>(</w:t>
+      </w:r>
+      <w:proofErr w:type="spellStart"/>
+      <w:r>
+        <w:rPr>
+          <w:lang w:val="en-US"/>
+        </w:rPr>
+        <w:t>y_true</w:t>
+      </w:r>
+      <w:proofErr w:type="spellEnd"/>
+      <w:r>
+        <w:rPr>
+          <w:lang w:val="en-US"/>
+        </w:rPr>
+        <w:t xml:space="preserve"> - </w:t>
+      </w:r>
+      <w:proofErr w:type="spellStart"/>
+      <w:r>
+        <w:rPr>
+          <w:lang w:val="en-US"/>
+        </w:rPr>
+        <w:t>y_pred</w:t>
+      </w:r>
+      <w:proofErr w:type="spellEnd"/>
+      <w:r>
+        <w:rPr>
+          <w:lang w:val="en-US"/>
+        </w:rPr>
+        <w:t>) ** 2)</w:t>
+      </w:r>
+    </w:p>
+    <w:p>
+      <w:pPr>
+        <w:spacing w:after="0"/>
+        <w:jc w:val="both"/>
+        <w:rPr>
+          <w:lang w:val="en-US"/>
+        </w:rPr>
+      </w:pPr>
+      <w:r>
+        <w:rPr>
+          <w:lang w:val="en-US"/>
+        </w:rPr>
+        <w:t xml:space="preserve">    </w:t>
+      </w:r>
+      <w:proofErr w:type="spellStart"/>
+      <w:r>
+        <w:rPr>
+          <w:lang w:val="en-US"/>
+        </w:rPr>
+        <w:t>ss_tot</w:t>
+      </w:r>
+      <w:proofErr w:type="spellEnd"/>
+      <w:r>
+        <w:rPr>
+          <w:lang w:val="en-US"/>
+        </w:rPr>
+        <w:t xml:space="preserve"> = </w:t>
+      </w:r>
+      <w:proofErr w:type="spellStart"/>
+      <w:proofErr w:type="gramStart"/>
+      <w:r>
+        <w:rPr>
+          <w:lang w:val="en-US"/>
+        </w:rPr>
+        <w:t>np.sum</w:t>
+      </w:r>
+      <w:proofErr w:type="spellEnd"/>
+      <w:r>
+        <w:rPr>
+          <w:lang w:val="en-US"/>
+        </w:rPr>
+        <w:t>(</w:t>
+      </w:r>
+      <w:proofErr w:type="gramEnd"/>
+      <w:r>
+        <w:rPr>
+          <w:lang w:val="en-US"/>
+        </w:rPr>
+        <w:t>(</w:t>
+      </w:r>
+      <w:proofErr w:type="spellStart"/>
+      <w:r>
+        <w:rPr>
+          <w:lang w:val="en-US"/>
+        </w:rPr>
+        <w:t>y_true</w:t>
+      </w:r>
+      <w:proofErr w:type="spellEnd"/>
+      <w:r>
+        <w:rPr>
+          <w:lang w:val="en-US"/>
+        </w:rPr>
+        <w:t xml:space="preserve"> - </w:t>
+      </w:r>
+      <w:proofErr w:type="spellStart"/>
+      <w:proofErr w:type="gramStart"/>
+      <w:r>
+        <w:rPr>
+          <w:lang w:val="en-US"/>
+        </w:rPr>
+        <w:t>np.mean</w:t>
+      </w:r>
+      <w:proofErr w:type="spellEnd"/>
+      <w:proofErr w:type="gramEnd"/>
+      <w:r>
+        <w:rPr>
+          <w:lang w:val="en-US"/>
+        </w:rPr>
+        <w:t>(</w:t>
+      </w:r>
+      <w:proofErr w:type="spellStart"/>
+      <w:r>
+        <w:rPr>
+          <w:lang w:val="en-US"/>
+        </w:rPr>
+        <w:t>y_true</w:t>
+      </w:r>
+      <w:proofErr w:type="spellEnd"/>
+      <w:r>
+        <w:rPr>
+          <w:lang w:val="en-US"/>
+        </w:rPr>
+        <w:t>)) ** 2)</w:t>
+      </w:r>
+    </w:p>
+    <w:p>
+      <w:pPr>
+        <w:spacing w:after="0"/>
+        <w:jc w:val="both"/>
+        <w:rPr>
+          <w:lang w:val="en-US"/>
+        </w:rPr>
+      </w:pPr>
+      <w:r>
+        <w:rPr>
+          <w:lang w:val="en-US"/>
+        </w:rPr>
+        <w:t xml:space="preserve">    return 1 - </w:t>
+      </w:r>
+      <w:proofErr w:type="spellStart"/>
+      <w:r>
+        <w:rPr>
+          <w:lang w:val="en-US"/>
+        </w:rPr>
+        <w:t>ss_res</w:t>
+      </w:r>
+      <w:proofErr w:type="spellEnd"/>
+      <w:r>
+        <w:rPr>
+          <w:lang w:val="en-US"/>
+        </w:rPr>
+        <w:t xml:space="preserve"> / </w:t>
+      </w:r>
+      <w:proofErr w:type="spellStart"/>
+      <w:r>
+        <w:rPr>
+          <w:lang w:val="en-US"/>
+        </w:rPr>
+        <w:t>ss_tot</w:t>
+      </w:r>
+      <w:proofErr w:type="spellEnd"/>
     </w:p>
     <w:p>
       <w:pPr>

</xml_diff>